<commit_message>
Documentation : contact renseigné (FlexLM, fiche de service)
Contact et accès alignés sur le mail de lancement.

Co-Authored-By: Claude Opus 5.5 <noreply@anthropic.com>
Claude-Session: https://claude.ai/code/session_01EG1MoyfukcioUxN5ji7Zfe
</commit_message>
<xml_diff>
--- a/documentation/documentation-de-service.docx
+++ b/documentation/documentation-de-service.docx
@@ -393,9 +393,8 @@
               <w:rPr>
                 <w:sz w:val="20"/>
                 <w:szCs w:val="20"/>
-                <w:highlight w:val="yellow"/>
-              </w:rPr>
-              <w:t xml:space="preserve">[Adresse mail ou équipe à contacter]</w:t>
+              </w:rPr>
+              <w:t xml:space="preserve">Alexis Francesco – alexis.francesco@airbus.com</w:t>
             </w:r>
           </w:p>
         </w:tc>
@@ -1418,30 +1417,6 @@
     <w:p>
       <w:pPr>
         <w:pStyle w:val="ListParagraph"/>
-        <w:keepNext/>
-        <w:keepLines/>
-        <w:numPr>
-          <w:ilvl w:val="0"/>
-          <w:numId w:val="3"/>
-        </w:numPr>
-        <w:spacing w:after="60"/>
-      </w:pPr>
-      <w:r>
-        <w:t xml:space="preserve">Connectez-vous : </w:t>
-      </w:r>
-      <w:r>
-        <w:rPr>
-          <w:highlight w:val="yellow"/>
-        </w:rPr>
-        <w:t xml:space="preserve">[mode de connexion / identifiant]</w:t>
-      </w:r>
-      <w:r>
-        <w:t xml:space="preserve">.</w:t>
-      </w:r>
-    </w:p>
-    <w:p>
-      <w:pPr>
-        <w:pStyle w:val="ListParagraph"/>
         <w:keepNext w:val="false"/>
         <w:keepLines/>
         <w:numPr>
@@ -2088,22 +2063,7 @@
                 <w:sz w:val="20"/>
                 <w:szCs w:val="20"/>
               </w:rPr>
-              <w:t xml:space="preserve">Consultez d'abord la documentation (partie 7), puis contactez </w:t>
-            </w:r>
-            <w:r>
-              <w:rPr>
-                <w:sz w:val="20"/>
-                <w:szCs w:val="20"/>
-                <w:highlight w:val="yellow"/>
-              </w:rPr>
-              <w:t xml:space="preserve">[contact]</w:t>
-            </w:r>
-            <w:r>
-              <w:rPr>
-                <w:sz w:val="20"/>
-                <w:szCs w:val="20"/>
-              </w:rPr>
-              <w:t xml:space="preserve">.</w:t>
+              <w:t xml:space="preserve">Consultez d'abord la documentation (partie 7), puis contactez Alexis Francesco (alexis.francesco@airbus.com).</w:t>
             </w:r>
           </w:p>
         </w:tc>
@@ -2160,22 +2120,7 @@
                 <w:sz w:val="20"/>
                 <w:szCs w:val="20"/>
               </w:rPr>
-              <w:t xml:space="preserve">Contactez </w:t>
-            </w:r>
-            <w:r>
-              <w:rPr>
-                <w:sz w:val="20"/>
-                <w:szCs w:val="20"/>
-                <w:highlight w:val="yellow"/>
-              </w:rPr>
-              <w:t xml:space="preserve">[contact]</w:t>
-            </w:r>
-            <w:r>
-              <w:rPr>
-                <w:sz w:val="20"/>
-                <w:szCs w:val="20"/>
-              </w:rPr>
-              <w:t xml:space="preserve"> en indiquant le dashboard, le serveur concerné, l'heure et si possible une capture d'écran.</w:t>
+              <w:t xml:space="preserve">Contactez Alexis Francesco (alexis.francesco@airbus.com) en indiquant le dashboard, le serveur concerné, l'heure et si possible une capture d'écran.</w:t>
             </w:r>
           </w:p>
         </w:tc>

</xml_diff>